<commit_message>
snapshot: pre-optimization baseline (3007 deleted, 397 new, 151 modified)
</commit_message>
<xml_diff>
--- a/papers/论文03_数据主权_总体国家安全观视域下政府数据开放平台的数据主权安全风险评估.docx
+++ b/papers/论文03_数据主权_总体国家安全观视域下政府数据开放平台的数据主权安全风险评估.docx
@@ -256,6 +256,21 @@
           <w:sz w:val="21"/>
         </w:rPr>
         <w:t>然而，现有研究多停留在国家层面的宏观分析，对政府数据开放平台等微观节点的数据主权安全风险评估缺乏关注。</w:t>
+      </w:r>
+      <w:r>
+        <w:rPr>
+          <w:rFonts w:ascii="宋体" w:hAnsi="宋体" w:eastAsia="宋体"/>
+          <w:b/>
+          <w:sz w:val="21"/>
+        </w:rPr>
+        <w:t>本文正是要将冉从敬教授的"数据主权安全"宏观理论"下沉"到平台层面——以23个省级平台为样本，将"数据管辖权、数据控制权、数据收益权"三维评估框架转化为可操作化的指标体系，实现从"理论构建"到"实证检验"的方法论闭环。</w:t>
+      </w:r>
+      <w:r>
+        <w:rPr>
+          <w:rFonts w:ascii="宋体" w:hAnsi="宋体" w:eastAsia="宋体"/>
+          <w:b w:val="0"/>
+          <w:sz w:val="21"/>
+        </w:rPr>
       </w:r>
     </w:p>
     <w:p>

</xml_diff>